<commit_message>
Make the portal deck and the answer form work as a pair
The deck explains and the Word form records. Question slides now point
to the form row ("Answer form, row B1") and to the walkthrough slide
that shows the screen involved; the intro slide says to open the form
beside the slides. The form calls itself the deck's companion, says
which slide explains each row, and starts each part on its own page,
like the deck's parts.

Co-Authored-By: Claude Opus 5.5 <noreply@anthropic.com>
</commit_message>
<xml_diff>
--- a/docs/guides/Decision Questions/DBGI Portal Answer Form.docx
+++ b/docs/guides/Decision Questions/DBGI Portal Answer Form.docx
@@ -22,7 +22,7 @@
           <w:sz w:val="60"/>
           <w:szCs w:val="60"/>
         </w:rPr>
-        <w:t xml:space="preserve">Portal Decisions: Answer Form</w:t>
+        <w:t xml:space="preserve">DBGI Portal Answer Form</w:t>
       </w:r>
     </w:p>
     <w:p>
@@ -42,7 +42,15 @@
           <w:sz w:val="28"/>
           <w:szCs w:val="28"/>
         </w:rPr>
-        <w:t xml:space="preserve">Fill in on screen, save, and send back</w:t>
+        <w:t xml:space="preserve">Companion to the "Using the DBGI Portal" slides</w:t>
+      </w:r>
+    </w:p>
+    <w:p>
+      <w:pPr>
+        <w:pStyle w:val="Normal"/>
+      </w:pPr>
+      <w:r>
+        <w:t xml:space="preserve">The slides explain each question: what it means, what the portal does today, and the choices. This form only records your answers, one row per question slide.</w:t>
       </w:r>
     </w:p>
     <w:p>
@@ -54,7 +62,7 @@
         </w:numPr>
       </w:pPr>
       <w:r>
-        <w:t xml:space="preserve">Open this file in </w:t>
+        <w:t xml:space="preserve">Open this form in </w:t>
       </w:r>
       <w:r>
         <w:rPr>
@@ -64,17 +72,7 @@
         <w:t xml:space="preserve">Microsoft Word</w:t>
       </w:r>
       <w:r>
-        <w:t xml:space="preserve"> (desktop or online). Go through it with the </w:t>
-      </w:r>
-      <w:r>
-        <w:rPr>
-          <w:b/>
-          <w:bCs/>
-        </w:rPr>
-        <w:t xml:space="preserve">Using the DBGI Portal</w:t>
-      </w:r>
-      <w:r>
-        <w:t xml:space="preserve"> slides open: each question shows the slide that explains it.</w:t>
+        <w:t xml:space="preserve"> (desktop or online) and the slides beside it. Each row shows the slide that explains it.</w:t>
       </w:r>
     </w:p>
     <w:p>
@@ -96,7 +94,7 @@
         <w:t xml:space="preserve">Pick an option</w:t>
       </w:r>
       <w:r>
-        <w:t xml:space="preserve"> to choose an answer, and </w:t>
+        <w:t xml:space="preserve"> to choose, and </w:t>
       </w:r>
       <w:r>
         <w:rPr>
@@ -130,7 +128,7 @@
         </w:numPr>
       </w:pPr>
       <w:r>
-        <w:t xml:space="preserve">Save the file and send it back to the person who sent you the slides.</w:t>
+        <w:t xml:space="preserve">Save the form and send it back to the person who sent you the slides.</w:t>
       </w:r>
     </w:p>
     <w:p>
@@ -349,7 +347,7 @@
                 <w:sz w:val="16"/>
                 <w:szCs w:val="16"/>
               </w:rPr>
-              <w:t xml:space="preserve">Slide 24</w:t>
+              <w:t xml:space="preserve">Explained on slide 24</w:t>
             </w:r>
           </w:p>
         </w:tc>
@@ -421,7 +419,7 @@
                 <w:sz w:val="16"/>
                 <w:szCs w:val="16"/>
               </w:rPr>
-              <w:t xml:space="preserve">Slide 25</w:t>
+              <w:t xml:space="preserve">Explained on slide 25</w:t>
             </w:r>
           </w:p>
         </w:tc>
@@ -493,7 +491,7 @@
                 <w:sz w:val="16"/>
                 <w:szCs w:val="16"/>
               </w:rPr>
-              <w:t xml:space="preserve">Slide 26</w:t>
+              <w:t xml:space="preserve">Explained on slide 26</w:t>
             </w:r>
           </w:p>
         </w:tc>
@@ -569,7 +567,7 @@
                 <w:sz w:val="16"/>
                 <w:szCs w:val="16"/>
               </w:rPr>
-              <w:t xml:space="preserve">Slide 27</w:t>
+              <w:t xml:space="preserve">Explained on slide 27</w:t>
             </w:r>
           </w:p>
         </w:tc>
@@ -646,7 +644,7 @@
                 <w:sz w:val="16"/>
                 <w:szCs w:val="16"/>
               </w:rPr>
-              <w:t xml:space="preserve">Slide 28</w:t>
+              <w:t xml:space="preserve">Explained on slide 28</w:t>
             </w:r>
           </w:p>
         </w:tc>
@@ -704,11 +702,10 @@
     <w:p>
       <w:pPr>
         <w:pStyle w:val="Heading1"/>
-        <w:keepNext/>
+        <w:pageBreakBefore/>
         <w:spacing w:before="200"/>
       </w:pPr>
       <w:r>
-        <w:br w:type="page"/>
         <w:t xml:space="preserve">Part B. Questions that block the next build (deal lifecycle)</w:t>
       </w:r>
     </w:p>
@@ -777,7 +774,7 @@
                 <w:sz w:val="16"/>
                 <w:szCs w:val="16"/>
               </w:rPr>
-              <w:t xml:space="preserve">Slide 29</w:t>
+              <w:t xml:space="preserve">Explained on slide 29</w:t>
             </w:r>
           </w:p>
         </w:tc>
@@ -853,7 +850,7 @@
                 <w:sz w:val="16"/>
                 <w:szCs w:val="16"/>
               </w:rPr>
-              <w:t xml:space="preserve">Slide 30</w:t>
+              <w:t xml:space="preserve">Explained on slide 30</w:t>
             </w:r>
           </w:p>
         </w:tc>
@@ -930,7 +927,7 @@
                 <w:sz w:val="16"/>
                 <w:szCs w:val="16"/>
               </w:rPr>
-              <w:t xml:space="preserve">Slide 31</w:t>
+              <w:t xml:space="preserve">Explained on slide 31</w:t>
             </w:r>
           </w:p>
         </w:tc>
@@ -1006,7 +1003,7 @@
                 <w:sz w:val="16"/>
                 <w:szCs w:val="16"/>
               </w:rPr>
-              <w:t xml:space="preserve">Slide 32</w:t>
+              <w:t xml:space="preserve">Explained on slide 32</w:t>
             </w:r>
           </w:p>
         </w:tc>
@@ -1081,7 +1078,7 @@
                 <w:sz w:val="16"/>
                 <w:szCs w:val="16"/>
               </w:rPr>
-              <w:t xml:space="preserve">Slide 33</w:t>
+              <w:t xml:space="preserve">Explained on slide 33</w:t>
             </w:r>
           </w:p>
         </w:tc>
@@ -1156,7 +1153,7 @@
                 <w:sz w:val="16"/>
                 <w:szCs w:val="16"/>
               </w:rPr>
-              <w:t xml:space="preserve">Slide 34</w:t>
+              <w:t xml:space="preserve">Explained on slide 34</w:t>
             </w:r>
           </w:p>
         </w:tc>
@@ -1232,7 +1229,7 @@
                 <w:sz w:val="16"/>
                 <w:szCs w:val="16"/>
               </w:rPr>
-              <w:t xml:space="preserve">Slide 35</w:t>
+              <w:t xml:space="preserve">Explained on slide 35</w:t>
             </w:r>
           </w:p>
         </w:tc>
@@ -1295,7 +1292,7 @@
     <w:p>
       <w:pPr>
         <w:pStyle w:val="Heading1"/>
-        <w:keepNext/>
+        <w:pageBreakBefore/>
         <w:spacing w:before="200"/>
       </w:pPr>
       <w:r>
@@ -1367,7 +1364,7 @@
                 <w:sz w:val="16"/>
                 <w:szCs w:val="16"/>
               </w:rPr>
-              <w:t xml:space="preserve">Slide 36</w:t>
+              <w:t xml:space="preserve">Explained on slide 36</w:t>
             </w:r>
           </w:p>
         </w:tc>
@@ -1443,7 +1440,7 @@
                 <w:sz w:val="16"/>
                 <w:szCs w:val="16"/>
               </w:rPr>
-              <w:t xml:space="preserve">Slide 37</w:t>
+              <w:t xml:space="preserve">Explained on slide 37</w:t>
             </w:r>
           </w:p>
         </w:tc>
@@ -1520,7 +1517,7 @@
                 <w:sz w:val="16"/>
                 <w:szCs w:val="16"/>
               </w:rPr>
-              <w:t xml:space="preserve">Slide 38</w:t>
+              <w:t xml:space="preserve">Explained on slide 38</w:t>
             </w:r>
           </w:p>
         </w:tc>
@@ -1596,7 +1593,7 @@
                 <w:sz w:val="16"/>
                 <w:szCs w:val="16"/>
               </w:rPr>
-              <w:t xml:space="preserve">Slide 39</w:t>
+              <w:t xml:space="preserve">Explained on slide 39</w:t>
             </w:r>
           </w:p>
         </w:tc>
@@ -1672,7 +1669,7 @@
                 <w:sz w:val="16"/>
                 <w:szCs w:val="16"/>
               </w:rPr>
-              <w:t xml:space="preserve">Slide 40</w:t>
+              <w:t xml:space="preserve">Explained on slide 40</w:t>
             </w:r>
           </w:p>
         </w:tc>
@@ -1733,7 +1730,7 @@
     <w:p>
       <w:pPr>
         <w:pStyle w:val="Heading1"/>
-        <w:keepNext/>
+        <w:pageBreakBefore/>
         <w:spacing w:before="200"/>
       </w:pPr>
       <w:r>
@@ -1805,7 +1802,7 @@
                 <w:sz w:val="16"/>
                 <w:szCs w:val="16"/>
               </w:rPr>
-              <w:t xml:space="preserve">Slide 41</w:t>
+              <w:t xml:space="preserve">Explained on slide 41</w:t>
             </w:r>
           </w:p>
         </w:tc>
@@ -1877,7 +1874,7 @@
                 <w:sz w:val="16"/>
                 <w:szCs w:val="16"/>
               </w:rPr>
-              <w:t xml:space="preserve">Slide 42</w:t>
+              <w:t xml:space="preserve">Explained on slide 42</w:t>
             </w:r>
           </w:p>
         </w:tc>
@@ -1953,7 +1950,7 @@
                 <w:sz w:val="16"/>
                 <w:szCs w:val="16"/>
               </w:rPr>
-              <w:t xml:space="preserve">Slide 43</w:t>
+              <w:t xml:space="preserve">Explained on slide 43</w:t>
             </w:r>
           </w:p>
         </w:tc>
@@ -2028,7 +2025,7 @@
                 <w:sz w:val="16"/>
                 <w:szCs w:val="16"/>
               </w:rPr>
-              <w:t xml:space="preserve">Slide 44</w:t>
+              <w:t xml:space="preserve">Explained on slide 44</w:t>
             </w:r>
           </w:p>
         </w:tc>

</xml_diff>

<commit_message>
Reframe the decision questions for a first-ever system
DBGI has no deal registration system today; the portal will be the
first. A2 asked how deals are handled without the portal, so replace
it with what happens to deals partners reported before launch: the
portal ranks only by its own submission time and cannot record an
earlier date. Reword A1, A5, and D1 to ask what DBGI wants rather than
what it does today, and rebuild the deck, answer form, and sheet.

Co-Authored-By: Claude Opus 5.5 <noreply@anthropic.com>
</commit_message>
<xml_diff>
--- a/docs/guides/Decision Questions/DBGI Portal Answer Form.docx
+++ b/docs/guides/Decision Questions/DBGI Portal Answer Form.docx
@@ -336,7 +336,7 @@
           </w:tcPr>
           <w:p>
             <w:r>
-              <w:t xml:space="preserve">A1. Does the basic flow match how DBGI works?</w:t>
+              <w:t xml:space="preserve">A1. Is this the process DBGI wants?</w:t>
               <w:br/>
             </w:r>
             <w:r>
@@ -408,7 +408,7 @@
           </w:tcPr>
           <w:p>
             <w:r>
-              <w:t xml:space="preserve">A2. How is this done today, without the portal?</w:t>
+              <w:t xml:space="preserve">A2. What about deals partners already told DBGI about?</w:t>
               <w:br/>
             </w:r>
             <w:r>
@@ -420,6 +420,236 @@
                 <w:szCs w:val="16"/>
               </w:rPr>
               <w:t xml:space="preserve">Explained on slide 25</w:t>
+            </w:r>
+          </w:p>
+        </w:tc>
+        <w:tc>
+          <w:tcPr>
+            <w:tcW w:w="2600" w:type="dxa"/>
+          </w:tcPr>
+          <w:p>
+            <w:sdt>
+              <w:sdtPr>
+                <w:alias w:val="A2 choice"/>
+                <w:tag w:val="A2-choice"/>
+                <w:id w:val="1000004"/>
+                <w:showingPlcHdr/>
+                <w:dropDownList>
+                  <w:listItem w:displayText="a: Start fresh: only deals submitted in the portal count, and partners are told the launch date in advance" w:value="a: Start fresh: only deals submitted in the portal count, and partners are told the launch date in advance"/>
+                  <w:listItem w:displayText="b: DBGI enters known deals at launch, with proof of the earlier date, and ranks them first" w:value="b: DBGI enters known deals at launch, with proof of the earlier date, and ranks them first"/>
+                  <w:listItem w:displayText="c: Partners get a short window (for example two weeks) to register existing deals, which DBGI reviews case by case" w:value="c: Partners get a short window (for example two weeks) to register existing deals, which DBGI reviews case by case"/>
+                  <w:listItem w:displayText="Keep what the portal does today" w:value="Keep what the portal does today"/>
+                  <w:listItem w:displayText="Other (see notes)" w:value="Other (see notes)"/>
+                  <w:listItem w:displayText="Skip, not my area" w:value="Skip, not my area"/>
+                </w:dropDownList>
+              </w:sdtPr>
+              <w:sdtContent>
+                <w:r>
+                  <w:rPr>
+                    <w:rStyle w:val="PlaceholderText"/>
+                  </w:rPr>
+                  <w:t xml:space="preserve">Pick an option.</w:t>
+                </w:r>
+              </w:sdtContent>
+            </w:sdt>
+          </w:p>
+        </w:tc>
+        <w:tc>
+          <w:tcPr>
+            <w:tcW w:w="2620" w:type="dxa"/>
+          </w:tcPr>
+          <w:p>
+            <w:sdt>
+              <w:sdtPr>
+                <w:alias w:val="A2 notes"/>
+                <w:tag w:val="A2-notes"/>
+                <w:id w:val="1000005"/>
+                <w:showingPlcHdr/>
+              </w:sdtPr>
+              <w:sdtContent>
+                <w:r>
+                  <w:rPr>
+                    <w:rStyle w:val="PlaceholderText"/>
+                  </w:rPr>
+                  <w:t xml:space="preserve">Type here.</w:t>
+                </w:r>
+              </w:sdtContent>
+            </w:sdt>
+          </w:p>
+        </w:tc>
+      </w:tr>
+      <w:tr>
+        <w:tc>
+          <w:tcPr>
+            <w:tcW w:w="3800" w:type="dxa"/>
+          </w:tcPr>
+          <w:p>
+            <w:r>
+              <w:t xml:space="preserve">A3. Who will actually use it first?</w:t>
+              <w:br/>
+            </w:r>
+            <w:r>
+              <w:rPr>
+                <w:b w:val="0"/>
+                <w:bCs w:val="0"/>
+                <w:color w:val="5B6B7A"/>
+                <w:sz w:val="16"/>
+                <w:szCs w:val="16"/>
+              </w:rPr>
+              <w:t xml:space="preserve">Explained on slide 26</w:t>
+            </w:r>
+          </w:p>
+        </w:tc>
+        <w:tc>
+          <w:tcPr>
+            <w:tcW w:w="2600" w:type="dxa"/>
+          </w:tcPr>
+          <w:p>
+            <w:sdt>
+              <w:sdtPr>
+                <w:alias w:val="A3 choice"/>
+                <w:tag w:val="A3-choice"/>
+                <w:id w:val="1000006"/>
+                <w:showingPlcHdr/>
+                <w:dropDownList>
+                  <w:listItem w:displayText="a: A small pilot with 2 to 3 trusted partners and one DBGI reviewer" w:value="a: A small pilot with 2 to 3 trusted partners and one DBGI reviewer"/>
+                  <w:listItem w:displayText="b: All partners at once" w:value="b: All partners at once"/>
+                  <w:listItem w:displayText="Keep what the portal does today" w:value="Keep what the portal does today"/>
+                  <w:listItem w:displayText="Other (see notes)" w:value="Other (see notes)"/>
+                  <w:listItem w:displayText="Skip, not my area" w:value="Skip, not my area"/>
+                </w:dropDownList>
+              </w:sdtPr>
+              <w:sdtContent>
+                <w:r>
+                  <w:rPr>
+                    <w:rStyle w:val="PlaceholderText"/>
+                  </w:rPr>
+                  <w:t xml:space="preserve">Pick an option.</w:t>
+                </w:r>
+              </w:sdtContent>
+            </w:sdt>
+          </w:p>
+        </w:tc>
+        <w:tc>
+          <w:tcPr>
+            <w:tcW w:w="2620" w:type="dxa"/>
+          </w:tcPr>
+          <w:p>
+            <w:sdt>
+              <w:sdtPr>
+                <w:alias w:val="A3 notes"/>
+                <w:tag w:val="A3-notes"/>
+                <w:id w:val="1000007"/>
+                <w:showingPlcHdr/>
+              </w:sdtPr>
+              <w:sdtContent>
+                <w:r>
+                  <w:rPr>
+                    <w:rStyle w:val="PlaceholderText"/>
+                  </w:rPr>
+                  <w:t xml:space="preserve">Type here.</w:t>
+                </w:r>
+              </w:sdtContent>
+            </w:sdt>
+          </w:p>
+        </w:tc>
+      </w:tr>
+      <w:tr>
+        <w:tc>
+          <w:tcPr>
+            <w:tcW w:w="3800" w:type="dxa"/>
+          </w:tcPr>
+          <w:p>
+            <w:r>
+              <w:t xml:space="preserve">A4. What must work on day one, and what can wait?</w:t>
+              <w:br/>
+            </w:r>
+            <w:r>
+              <w:rPr>
+                <w:b w:val="0"/>
+                <w:bCs w:val="0"/>
+                <w:color w:val="5B6B7A"/>
+                <w:sz w:val="16"/>
+                <w:szCs w:val="16"/>
+              </w:rPr>
+              <w:t xml:space="preserve">Explained on slide 27</w:t>
+            </w:r>
+          </w:p>
+        </w:tc>
+        <w:tc>
+          <w:tcPr>
+            <w:tcW w:w="2600" w:type="dxa"/>
+          </w:tcPr>
+          <w:p>
+            <w:sdt>
+              <w:sdtPr>
+                <w:alias w:val="A4 choice"/>
+                <w:tag w:val="A4-choice"/>
+                <w:id w:val="1000008"/>
+                <w:showingPlcHdr/>
+                <w:dropDownList>
+                  <w:listItem w:displayText="a: Launch with today's loop plus withdrawal" w:value="a: Launch with today's loop plus withdrawal"/>
+                  <w:listItem w:displayText="b: Wait for pricing history too" w:value="b: Wait for pricing history too"/>
+                  <w:listItem w:displayText="c: Wait for reorders as well" w:value="c: Wait for reorders as well"/>
+                  <w:listItem w:displayText="Keep what the portal does today" w:value="Keep what the portal does today"/>
+                  <w:listItem w:displayText="Other (see notes)" w:value="Other (see notes)"/>
+                  <w:listItem w:displayText="Skip, not my area" w:value="Skip, not my area"/>
+                </w:dropDownList>
+              </w:sdtPr>
+              <w:sdtContent>
+                <w:r>
+                  <w:rPr>
+                    <w:rStyle w:val="PlaceholderText"/>
+                  </w:rPr>
+                  <w:t xml:space="preserve">Pick an option.</w:t>
+                </w:r>
+              </w:sdtContent>
+            </w:sdt>
+          </w:p>
+        </w:tc>
+        <w:tc>
+          <w:tcPr>
+            <w:tcW w:w="2620" w:type="dxa"/>
+          </w:tcPr>
+          <w:p>
+            <w:sdt>
+              <w:sdtPr>
+                <w:alias w:val="A4 notes"/>
+                <w:tag w:val="A4-notes"/>
+                <w:id w:val="1000009"/>
+                <w:showingPlcHdr/>
+              </w:sdtPr>
+              <w:sdtContent>
+                <w:r>
+                  <w:rPr>
+                    <w:rStyle w:val="PlaceholderText"/>
+                  </w:rPr>
+                  <w:t xml:space="preserve">Type here.</w:t>
+                </w:r>
+              </w:sdtContent>
+            </w:sdt>
+          </w:p>
+        </w:tc>
+      </w:tr>
+      <w:tr>
+        <w:tc>
+          <w:tcPr>
+            <w:tcW w:w="3800" w:type="dxa"/>
+          </w:tcPr>
+          <w:p>
+            <w:r>
+              <w:t xml:space="preserve">A5. Do the words make sense to partners?</w:t>
+              <w:br/>
+            </w:r>
+            <w:r>
+              <w:rPr>
+                <w:b w:val="0"/>
+                <w:bCs w:val="0"/>
+                <w:color w:val="5B6B7A"/>
+                <w:sz w:val="16"/>
+                <w:szCs w:val="16"/>
+              </w:rPr>
+              <w:t xml:space="preserve">Explained on slide 28</w:t>
             </w:r>
           </w:p>
         </w:tc>
@@ -456,234 +686,9 @@
           <w:p>
             <w:sdt>
               <w:sdtPr>
-                <w:alias w:val="A2 notes"/>
-                <w:tag w:val="A2-notes"/>
-                <w:id w:val="1000004"/>
-                <w:showingPlcHdr/>
-              </w:sdtPr>
-              <w:sdtContent>
-                <w:r>
-                  <w:rPr>
-                    <w:rStyle w:val="PlaceholderText"/>
-                  </w:rPr>
-                  <w:t xml:space="preserve">Type here.</w:t>
-                </w:r>
-              </w:sdtContent>
-            </w:sdt>
-          </w:p>
-        </w:tc>
-      </w:tr>
-      <w:tr>
-        <w:tc>
-          <w:tcPr>
-            <w:tcW w:w="3800" w:type="dxa"/>
-          </w:tcPr>
-          <w:p>
-            <w:r>
-              <w:t xml:space="preserve">A3. Who will actually use it first?</w:t>
-              <w:br/>
-            </w:r>
-            <w:r>
-              <w:rPr>
-                <w:b w:val="0"/>
-                <w:bCs w:val="0"/>
-                <w:color w:val="5B6B7A"/>
-                <w:sz w:val="16"/>
-                <w:szCs w:val="16"/>
-              </w:rPr>
-              <w:t xml:space="preserve">Explained on slide 26</w:t>
-            </w:r>
-          </w:p>
-        </w:tc>
-        <w:tc>
-          <w:tcPr>
-            <w:tcW w:w="2600" w:type="dxa"/>
-          </w:tcPr>
-          <w:p>
-            <w:sdt>
-              <w:sdtPr>
-                <w:alias w:val="A3 choice"/>
-                <w:tag w:val="A3-choice"/>
-                <w:id w:val="1000005"/>
-                <w:showingPlcHdr/>
-                <w:dropDownList>
-                  <w:listItem w:displayText="a: A small pilot with 2 to 3 trusted partners and one DBGI reviewer" w:value="a: A small pilot with 2 to 3 trusted partners and one DBGI reviewer"/>
-                  <w:listItem w:displayText="b: All partners at once" w:value="b: All partners at once"/>
-                  <w:listItem w:displayText="Keep what the portal does today" w:value="Keep what the portal does today"/>
-                  <w:listItem w:displayText="Other (see notes)" w:value="Other (see notes)"/>
-                  <w:listItem w:displayText="Skip, not my area" w:value="Skip, not my area"/>
-                </w:dropDownList>
-              </w:sdtPr>
-              <w:sdtContent>
-                <w:r>
-                  <w:rPr>
-                    <w:rStyle w:val="PlaceholderText"/>
-                  </w:rPr>
-                  <w:t xml:space="preserve">Pick an option.</w:t>
-                </w:r>
-              </w:sdtContent>
-            </w:sdt>
-          </w:p>
-        </w:tc>
-        <w:tc>
-          <w:tcPr>
-            <w:tcW w:w="2620" w:type="dxa"/>
-          </w:tcPr>
-          <w:p>
-            <w:sdt>
-              <w:sdtPr>
-                <w:alias w:val="A3 notes"/>
-                <w:tag w:val="A3-notes"/>
-                <w:id w:val="1000006"/>
-                <w:showingPlcHdr/>
-              </w:sdtPr>
-              <w:sdtContent>
-                <w:r>
-                  <w:rPr>
-                    <w:rStyle w:val="PlaceholderText"/>
-                  </w:rPr>
-                  <w:t xml:space="preserve">Type here.</w:t>
-                </w:r>
-              </w:sdtContent>
-            </w:sdt>
-          </w:p>
-        </w:tc>
-      </w:tr>
-      <w:tr>
-        <w:tc>
-          <w:tcPr>
-            <w:tcW w:w="3800" w:type="dxa"/>
-          </w:tcPr>
-          <w:p>
-            <w:r>
-              <w:t xml:space="preserve">A4. What must work on day one, and what can wait?</w:t>
-              <w:br/>
-            </w:r>
-            <w:r>
-              <w:rPr>
-                <w:b w:val="0"/>
-                <w:bCs w:val="0"/>
-                <w:color w:val="5B6B7A"/>
-                <w:sz w:val="16"/>
-                <w:szCs w:val="16"/>
-              </w:rPr>
-              <w:t xml:space="preserve">Explained on slide 27</w:t>
-            </w:r>
-          </w:p>
-        </w:tc>
-        <w:tc>
-          <w:tcPr>
-            <w:tcW w:w="2600" w:type="dxa"/>
-          </w:tcPr>
-          <w:p>
-            <w:sdt>
-              <w:sdtPr>
-                <w:alias w:val="A4 choice"/>
-                <w:tag w:val="A4-choice"/>
-                <w:id w:val="1000007"/>
-                <w:showingPlcHdr/>
-                <w:dropDownList>
-                  <w:listItem w:displayText="a: Launch with today's loop plus withdrawal" w:value="a: Launch with today's loop plus withdrawal"/>
-                  <w:listItem w:displayText="b: Wait for pricing history too" w:value="b: Wait for pricing history too"/>
-                  <w:listItem w:displayText="c: Wait for reorders as well" w:value="c: Wait for reorders as well"/>
-                  <w:listItem w:displayText="Keep what the portal does today" w:value="Keep what the portal does today"/>
-                  <w:listItem w:displayText="Other (see notes)" w:value="Other (see notes)"/>
-                  <w:listItem w:displayText="Skip, not my area" w:value="Skip, not my area"/>
-                </w:dropDownList>
-              </w:sdtPr>
-              <w:sdtContent>
-                <w:r>
-                  <w:rPr>
-                    <w:rStyle w:val="PlaceholderText"/>
-                  </w:rPr>
-                  <w:t xml:space="preserve">Pick an option.</w:t>
-                </w:r>
-              </w:sdtContent>
-            </w:sdt>
-          </w:p>
-        </w:tc>
-        <w:tc>
-          <w:tcPr>
-            <w:tcW w:w="2620" w:type="dxa"/>
-          </w:tcPr>
-          <w:p>
-            <w:sdt>
-              <w:sdtPr>
-                <w:alias w:val="A4 notes"/>
-                <w:tag w:val="A4-notes"/>
-                <w:id w:val="1000008"/>
-                <w:showingPlcHdr/>
-              </w:sdtPr>
-              <w:sdtContent>
-                <w:r>
-                  <w:rPr>
-                    <w:rStyle w:val="PlaceholderText"/>
-                  </w:rPr>
-                  <w:t xml:space="preserve">Type here.</w:t>
-                </w:r>
-              </w:sdtContent>
-            </w:sdt>
-          </w:p>
-        </w:tc>
-      </w:tr>
-      <w:tr>
-        <w:tc>
-          <w:tcPr>
-            <w:tcW w:w="3800" w:type="dxa"/>
-          </w:tcPr>
-          <w:p>
-            <w:r>
-              <w:t xml:space="preserve">A5. Do the words make sense to partners?</w:t>
-              <w:br/>
-            </w:r>
-            <w:r>
-              <w:rPr>
-                <w:b w:val="0"/>
-                <w:bCs w:val="0"/>
-                <w:color w:val="5B6B7A"/>
-                <w:sz w:val="16"/>
-                <w:szCs w:val="16"/>
-              </w:rPr>
-              <w:t xml:space="preserve">Explained on slide 28</w:t>
-            </w:r>
-          </w:p>
-        </w:tc>
-        <w:tc>
-          <w:tcPr>
-            <w:tcW w:w="2600" w:type="dxa"/>
-          </w:tcPr>
-          <w:p>
-            <w:pPr>
-              <w:rPr>
-                <w:i/>
-                <w:iCs/>
-                <w:color w:val="5B6B7A"/>
-                <w:sz w:val="18"/>
-                <w:szCs w:val="18"/>
-              </w:rPr>
-            </w:pPr>
-            <w:r>
-              <w:rPr>
-                <w:i/>
-                <w:iCs/>
-                <w:color w:val="5B6B7A"/>
-                <w:sz w:val="18"/>
-                <w:szCs w:val="18"/>
-              </w:rPr>
-              <w:t xml:space="preserve">Open question: answer in Notes</w:t>
-            </w:r>
-          </w:p>
-        </w:tc>
-        <w:tc>
-          <w:tcPr>
-            <w:tcW w:w="2620" w:type="dxa"/>
-          </w:tcPr>
-          <w:p>
-            <w:sdt>
-              <w:sdtPr>
                 <w:alias w:val="A5 notes"/>
                 <w:tag w:val="A5-notes"/>
-                <w:id w:val="1000009"/>
+                <w:id w:val="1000010"/>
                 <w:showingPlcHdr/>
               </w:sdtPr>
               <w:sdtContent>
@@ -787,7 +792,7 @@
               <w:sdtPr>
                 <w:alias w:val="B1 choice"/>
                 <w:tag w:val="B1-choice"/>
-                <w:id w:val="1000010"/>
+                <w:id w:val="1000011"/>
                 <w:showingPlcHdr/>
                 <w:dropDownList>
                   <w:listItem w:displayText="a: Keep today's rule" w:value="a: Keep today's rule"/>
@@ -817,7 +822,7 @@
               <w:sdtPr>
                 <w:alias w:val="B1 notes"/>
                 <w:tag w:val="B1-notes"/>
-                <w:id w:val="1000011"/>
+                <w:id w:val="1000012"/>
                 <w:showingPlcHdr/>
               </w:sdtPr>
               <w:sdtContent>
@@ -863,7 +868,7 @@
               <w:sdtPr>
                 <w:alias w:val="B2 choice"/>
                 <w:tag w:val="B2-choice"/>
-                <w:id w:val="1000012"/>
+                <w:id w:val="1000013"/>
                 <w:showingPlcHdr/>
                 <w:dropDownList>
                   <w:listItem w:displayText="a: Partner requests, DBGI confirms, the place in line is lost for good" w:value="a: Partner requests, DBGI confirms, the place in line is lost for good"/>
@@ -894,7 +899,7 @@
               <w:sdtPr>
                 <w:alias w:val="B2 notes"/>
                 <w:tag w:val="B2-notes"/>
-                <w:id w:val="1000013"/>
+                <w:id w:val="1000014"/>
                 <w:showingPlcHdr/>
               </w:sdtPr>
               <w:sdtContent>
@@ -940,7 +945,7 @@
               <w:sdtPr>
                 <w:alias w:val="B3 choice"/>
                 <w:tag w:val="B3-choice"/>
-                <w:id w:val="1000014"/>
+                <w:id w:val="1000015"/>
                 <w:showingPlcHdr/>
                 <w:dropDownList>
                   <w:listItem w:displayText="a: Always keep each registration's original submission time for ranking, and re-review prices after any merge or split" w:value="a: Always keep each registration's original submission time for ranking, and re-review prices after any merge or split"/>
@@ -970,7 +975,7 @@
               <w:sdtPr>
                 <w:alias w:val="B3 notes"/>
                 <w:tag w:val="B3-notes"/>
-                <w:id w:val="1000015"/>
+                <w:id w:val="1000016"/>
                 <w:showingPlcHdr/>
               </w:sdtPr>
               <w:sdtContent>
@@ -1016,7 +1021,7 @@
               <w:sdtPr>
                 <w:alias w:val="B4 choice"/>
                 <w:tag w:val="B4-choice"/>
-                <w:id w:val="1000016"/>
+                <w:id w:val="1000017"/>
                 <w:showingPlcHdr/>
                 <w:dropDownList>
                   <w:listItem w:displayText="a: Keep DBGI only" w:value="a: Keep DBGI only"/>
@@ -1045,7 +1050,7 @@
               <w:sdtPr>
                 <w:alias w:val="B4 notes"/>
                 <w:tag w:val="B4-notes"/>
-                <w:id w:val="1000017"/>
+                <w:id w:val="1000018"/>
                 <w:showingPlcHdr/>
               </w:sdtPr>
               <w:sdtContent>
@@ -1091,7 +1096,7 @@
               <w:sdtPr>
                 <w:alias w:val="B5 choice"/>
                 <w:tag w:val="B5-choice"/>
-                <w:id w:val="1000018"/>
+                <w:id w:val="1000019"/>
                 <w:showingPlcHdr/>
                 <w:dropDownList>
                   <w:listItem w:displayText="a: Keep a shared rank, DBGI decides" w:value="a: Keep a shared rank, DBGI decides"/>
@@ -1120,7 +1125,7 @@
               <w:sdtPr>
                 <w:alias w:val="B5 notes"/>
                 <w:tag w:val="B5-notes"/>
-                <w:id w:val="1000019"/>
+                <w:id w:val="1000020"/>
                 <w:showingPlcHdr/>
               </w:sdtPr>
               <w:sdtContent>
@@ -1166,7 +1171,7 @@
               <w:sdtPr>
                 <w:alias w:val="B6 choice"/>
                 <w:tag w:val="B6-choice"/>
-                <w:id w:val="1000020"/>
+                <w:id w:val="1000021"/>
                 <w:showingPlcHdr/>
                 <w:dropDownList>
                   <w:listItem w:displayText="a: 60 days, with a reminder 7 days before, then DBGI reviews" w:value="a: 60 days, with a reminder 7 days before, then DBGI reviews"/>
@@ -1196,7 +1201,7 @@
               <w:sdtPr>
                 <w:alias w:val="B6 notes"/>
                 <w:tag w:val="B6-notes"/>
-                <w:id w:val="1000021"/>
+                <w:id w:val="1000022"/>
                 <w:showingPlcHdr/>
               </w:sdtPr>
               <w:sdtContent>
@@ -1242,7 +1247,7 @@
               <w:sdtPr>
                 <w:alias w:val="B7 choice"/>
                 <w:tag w:val="B7-choice"/>
-                <w:id w:val="1000022"/>
+                <w:id w:val="1000023"/>
                 <w:showingPlcHdr/>
                 <w:dropDownList>
                   <w:listItem w:displayText="a: A repost of the same project keeps the original place in line" w:value="a: A repost of the same project keeps the original place in line"/>
@@ -1273,7 +1278,7 @@
               <w:sdtPr>
                 <w:alias w:val="B7 notes"/>
                 <w:tag w:val="B7-notes"/>
-                <w:id w:val="1000023"/>
+                <w:id w:val="1000024"/>
                 <w:showingPlcHdr/>
               </w:sdtPr>
               <w:sdtContent>
@@ -1377,7 +1382,7 @@
               <w:sdtPr>
                 <w:alias w:val="C1 choice"/>
                 <w:tag w:val="C1-choice"/>
-                <w:id w:val="1000024"/>
+                <w:id w:val="1000025"/>
                 <w:showingPlcHdr/>
                 <w:dropDownList>
                   <w:listItem w:displayText="a: 90 days, reminder 14 days before" w:value="a: 90 days, reminder 14 days before"/>
@@ -1407,7 +1412,7 @@
               <w:sdtPr>
                 <w:alias w:val="C1 notes"/>
                 <w:tag w:val="C1-notes"/>
-                <w:id w:val="1000025"/>
+                <w:id w:val="1000026"/>
                 <w:showingPlcHdr/>
               </w:sdtPr>
               <w:sdtContent>
@@ -1453,7 +1458,7 @@
               <w:sdtPr>
                 <w:alias w:val="C2 choice"/>
                 <w:tag w:val="C2-choice"/>
-                <w:id w:val="1000026"/>
+                <w:id w:val="1000027"/>
                 <w:showingPlcHdr/>
                 <w:dropDownList>
                   <w:listItem w:displayText="a: All prices VAT-inclusive" w:value="a: All prices VAT-inclusive"/>
@@ -1484,7 +1489,7 @@
               <w:sdtPr>
                 <w:alias w:val="C2 notes"/>
                 <w:tag w:val="C2-notes"/>
-                <w:id w:val="1000027"/>
+                <w:id w:val="1000028"/>
                 <w:showingPlcHdr/>
               </w:sdtPr>
               <w:sdtContent>
@@ -1530,7 +1535,7 @@
               <w:sdtPr>
                 <w:alias w:val="C3 choice"/>
                 <w:tag w:val="C3-choice"/>
-                <w:id w:val="1000028"/>
+                <w:id w:val="1000029"/>
                 <w:showingPlcHdr/>
                 <w:dropDownList>
                   <w:listItem w:displayText="a: Round each line to 2 decimals, add the lines" w:value="a: Round each line to 2 decimals, add the lines"/>
@@ -1560,7 +1565,7 @@
               <w:sdtPr>
                 <w:alias w:val="C3 notes"/>
                 <w:tag w:val="C3-notes"/>
-                <w:id w:val="1000029"/>
+                <w:id w:val="1000030"/>
                 <w:showingPlcHdr/>
               </w:sdtPr>
               <w:sdtContent>
@@ -1606,7 +1611,7 @@
               <w:sdtPr>
                 <w:alias w:val="C4 choice"/>
                 <w:tag w:val="C4-choice"/>
-                <w:id w:val="1000030"/>
+                <w:id w:val="1000031"/>
                 <w:showingPlcHdr/>
                 <w:dropDownList>
                   <w:listItem w:displayText="a: DBGI adds the product to the catalog first, then it gets reviewed" w:value="a: DBGI adds the product to the catalog first, then it gets reviewed"/>
@@ -1636,7 +1641,7 @@
               <w:sdtPr>
                 <w:alias w:val="C4 notes"/>
                 <w:tag w:val="C4-notes"/>
-                <w:id w:val="1000031"/>
+                <w:id w:val="1000032"/>
                 <w:showingPlcHdr/>
               </w:sdtPr>
               <w:sdtContent>
@@ -1682,7 +1687,7 @@
               <w:sdtPr>
                 <w:alias w:val="C5 choice"/>
                 <w:tag w:val="C5-choice"/>
-                <w:id w:val="1000032"/>
+                <w:id w:val="1000033"/>
                 <w:showingPlcHdr/>
                 <w:dropDownList>
                   <w:listItem w:displayText="a: Keep today's rule" w:value="a: Keep today's rule"/>
@@ -1711,7 +1716,7 @@
               <w:sdtPr>
                 <w:alias w:val="C5 notes"/>
                 <w:tag w:val="C5-notes"/>
-                <w:id w:val="1000033"/>
+                <w:id w:val="1000034"/>
                 <w:showingPlcHdr/>
               </w:sdtPr>
               <w:sdtContent>
@@ -1841,7 +1846,7 @@
               <w:sdtPr>
                 <w:alias w:val="D1 notes"/>
                 <w:tag w:val="D1-notes"/>
-                <w:id w:val="1000034"/>
+                <w:id w:val="1000035"/>
                 <w:showingPlcHdr/>
               </w:sdtPr>
               <w:sdtContent>
@@ -1887,7 +1892,7 @@
               <w:sdtPr>
                 <w:alias w:val="D2 choice"/>
                 <w:tag w:val="D2-choice"/>
-                <w:id w:val="1000035"/>
+                <w:id w:val="1000036"/>
                 <w:showingPlcHdr/>
                 <w:dropDownList>
                   <w:listItem w:displayText="a: Keep today's rule" w:value="a: Keep today's rule"/>
@@ -1917,7 +1922,7 @@
               <w:sdtPr>
                 <w:alias w:val="D2 notes"/>
                 <w:tag w:val="D2-notes"/>
-                <w:id w:val="1000036"/>
+                <w:id w:val="1000037"/>
                 <w:showingPlcHdr/>
               </w:sdtPr>
               <w:sdtContent>
@@ -1963,7 +1968,7 @@
               <w:sdtPr>
                 <w:alias w:val="D3 choice"/>
                 <w:tag w:val="D3-choice"/>
-                <w:id w:val="1000037"/>
+                <w:id w:val="1000038"/>
                 <w:showingPlcHdr/>
                 <w:dropDownList>
                   <w:listItem w:displayText="a: Keep everything for 5 years, daily backups, back within one working day" w:value="a: Keep everything for 5 years, daily backups, back within one working day"/>
@@ -1992,7 +1997,7 @@
               <w:sdtPr>
                 <w:alias w:val="D3 notes"/>
                 <w:tag w:val="D3-notes"/>
-                <w:id w:val="1000038"/>
+                <w:id w:val="1000039"/>
                 <w:showingPlcHdr/>
               </w:sdtPr>
               <w:sdtContent>
@@ -2038,7 +2043,7 @@
               <w:sdtPr>
                 <w:alias w:val="D4 choice"/>
                 <w:tag w:val="D4-choice"/>
-                <w:id w:val="1000039"/>
+                <w:id w:val="1000040"/>
                 <w:showingPlcHdr/>
                 <w:dropDownList>
                   <w:listItem w:displayText="a: Monday to Friday, Philippine public holidays excluded, 5:00 PM cutoff" w:value="a: Monday to Friday, Philippine public holidays excluded, 5:00 PM cutoff"/>
@@ -2068,7 +2073,7 @@
               <w:sdtPr>
                 <w:alias w:val="D4 notes"/>
                 <w:tag w:val="D4-notes"/>
-                <w:id w:val="1000040"/>
+                <w:id w:val="1000041"/>
                 <w:showingPlcHdr/>
               </w:sdtPr>
               <w:sdtContent>
@@ -2106,7 +2111,7 @@
         <w:sdtPr>
           <w:alias w:val="Other comments"/>
           <w:tag w:val="comments"/>
-          <w:id w:val="1000041"/>
+          <w:id w:val="1000042"/>
           <w:showingPlcHdr/>
         </w:sdtPr>
         <w:sdtContent>

</xml_diff>

<commit_message>
Drop the pre-launch deals question
The deal registration program and the product are both new, so there
are no existing deals, partner claims, or promised prices to bring in.
Remove that question, record the fact in Part A, renumber Part A to
A1-A4, and rebuild the deck (44 slides), answer form, and sheet.

Co-Authored-By: Claude Opus 5.5 <noreply@anthropic.com>
</commit_message>
<xml_diff>
--- a/docs/guides/Decision Questions/DBGI Portal Answer Form.docx
+++ b/docs/guides/Decision Questions/DBGI Portal Answer Form.docx
@@ -408,7 +408,7 @@
           </w:tcPr>
           <w:p>
             <w:r>
-              <w:t xml:space="preserve">A2. What about deals partners already told DBGI about?</w:t>
+              <w:t xml:space="preserve">A2. Who will actually use it first?</w:t>
               <w:br/>
             </w:r>
             <w:r>
@@ -435,9 +435,8 @@
                 <w:id w:val="1000004"/>
                 <w:showingPlcHdr/>
                 <w:dropDownList>
-                  <w:listItem w:displayText="a: Start fresh: only deals submitted in the portal count, and partners are told the launch date in advance" w:value="a: Start fresh: only deals submitted in the portal count, and partners are told the launch date in advance"/>
-                  <w:listItem w:displayText="b: DBGI enters known deals at launch, with proof of the earlier date, and ranks them first" w:value="b: DBGI enters known deals at launch, with proof of the earlier date, and ranks them first"/>
-                  <w:listItem w:displayText="c: Partners get a short window (for example two weeks) to register existing deals, which DBGI reviews case by case" w:value="c: Partners get a short window (for example two weeks) to register existing deals, which DBGI reviews case by case"/>
+                  <w:listItem w:displayText="a: A small pilot with 2 to 3 trusted partners and one DBGI reviewer" w:value="a: A small pilot with 2 to 3 trusted partners and one DBGI reviewer"/>
+                  <w:listItem w:displayText="b: All partners at once" w:value="b: All partners at once"/>
                   <w:listItem w:displayText="Keep what the portal does today" w:value="Keep what the portal does today"/>
                   <w:listItem w:displayText="Other (see notes)" w:value="Other (see notes)"/>
                   <w:listItem w:displayText="Skip, not my area" w:value="Skip, not my area"/>
@@ -485,7 +484,7 @@
           </w:tcPr>
           <w:p>
             <w:r>
-              <w:t xml:space="preserve">A3. Who will actually use it first?</w:t>
+              <w:t xml:space="preserve">A3. What must work on day one, and what can wait?</w:t>
               <w:br/>
             </w:r>
             <w:r>
@@ -512,8 +511,9 @@
                 <w:id w:val="1000006"/>
                 <w:showingPlcHdr/>
                 <w:dropDownList>
-                  <w:listItem w:displayText="a: A small pilot with 2 to 3 trusted partners and one DBGI reviewer" w:value="a: A small pilot with 2 to 3 trusted partners and one DBGI reviewer"/>
-                  <w:listItem w:displayText="b: All partners at once" w:value="b: All partners at once"/>
+                  <w:listItem w:displayText="a: Launch with today's loop plus withdrawal" w:value="a: Launch with today's loop plus withdrawal"/>
+                  <w:listItem w:displayText="b: Wait for pricing history too" w:value="b: Wait for pricing history too"/>
+                  <w:listItem w:displayText="c: Wait for reorders as well" w:value="c: Wait for reorders as well"/>
                   <w:listItem w:displayText="Keep what the portal does today" w:value="Keep what the portal does today"/>
                   <w:listItem w:displayText="Other (see notes)" w:value="Other (see notes)"/>
                   <w:listItem w:displayText="Skip, not my area" w:value="Skip, not my area"/>
@@ -561,7 +561,7 @@
           </w:tcPr>
           <w:p>
             <w:r>
-              <w:t xml:space="preserve">A4. What must work on day one, and what can wait?</w:t>
+              <w:t xml:space="preserve">A4. Do the words make sense to partners?</w:t>
               <w:br/>
             </w:r>
             <w:r>
@@ -573,83 +573,6 @@
                 <w:szCs w:val="16"/>
               </w:rPr>
               <w:t xml:space="preserve">Explained on slide 27</w:t>
-            </w:r>
-          </w:p>
-        </w:tc>
-        <w:tc>
-          <w:tcPr>
-            <w:tcW w:w="2600" w:type="dxa"/>
-          </w:tcPr>
-          <w:p>
-            <w:sdt>
-              <w:sdtPr>
-                <w:alias w:val="A4 choice"/>
-                <w:tag w:val="A4-choice"/>
-                <w:id w:val="1000008"/>
-                <w:showingPlcHdr/>
-                <w:dropDownList>
-                  <w:listItem w:displayText="a: Launch with today's loop plus withdrawal" w:value="a: Launch with today's loop plus withdrawal"/>
-                  <w:listItem w:displayText="b: Wait for pricing history too" w:value="b: Wait for pricing history too"/>
-                  <w:listItem w:displayText="c: Wait for reorders as well" w:value="c: Wait for reorders as well"/>
-                  <w:listItem w:displayText="Keep what the portal does today" w:value="Keep what the portal does today"/>
-                  <w:listItem w:displayText="Other (see notes)" w:value="Other (see notes)"/>
-                  <w:listItem w:displayText="Skip, not my area" w:value="Skip, not my area"/>
-                </w:dropDownList>
-              </w:sdtPr>
-              <w:sdtContent>
-                <w:r>
-                  <w:rPr>
-                    <w:rStyle w:val="PlaceholderText"/>
-                  </w:rPr>
-                  <w:t xml:space="preserve">Pick an option.</w:t>
-                </w:r>
-              </w:sdtContent>
-            </w:sdt>
-          </w:p>
-        </w:tc>
-        <w:tc>
-          <w:tcPr>
-            <w:tcW w:w="2620" w:type="dxa"/>
-          </w:tcPr>
-          <w:p>
-            <w:sdt>
-              <w:sdtPr>
-                <w:alias w:val="A4 notes"/>
-                <w:tag w:val="A4-notes"/>
-                <w:id w:val="1000009"/>
-                <w:showingPlcHdr/>
-              </w:sdtPr>
-              <w:sdtContent>
-                <w:r>
-                  <w:rPr>
-                    <w:rStyle w:val="PlaceholderText"/>
-                  </w:rPr>
-                  <w:t xml:space="preserve">Type here.</w:t>
-                </w:r>
-              </w:sdtContent>
-            </w:sdt>
-          </w:p>
-        </w:tc>
-      </w:tr>
-      <w:tr>
-        <w:tc>
-          <w:tcPr>
-            <w:tcW w:w="3800" w:type="dxa"/>
-          </w:tcPr>
-          <w:p>
-            <w:r>
-              <w:t xml:space="preserve">A5. Do the words make sense to partners?</w:t>
-              <w:br/>
-            </w:r>
-            <w:r>
-              <w:rPr>
-                <w:b w:val="0"/>
-                <w:bCs w:val="0"/>
-                <w:color w:val="5B6B7A"/>
-                <w:sz w:val="16"/>
-                <w:szCs w:val="16"/>
-              </w:rPr>
-              <w:t xml:space="preserve">Explained on slide 28</w:t>
             </w:r>
           </w:p>
         </w:tc>
@@ -686,9 +609,9 @@
           <w:p>
             <w:sdt>
               <w:sdtPr>
-                <w:alias w:val="A5 notes"/>
-                <w:tag w:val="A5-notes"/>
-                <w:id w:val="1000010"/>
+                <w:alias w:val="A4 notes"/>
+                <w:tag w:val="A4-notes"/>
+                <w:id w:val="1000008"/>
                 <w:showingPlcHdr/>
               </w:sdtPr>
               <w:sdtContent>
@@ -779,7 +702,7 @@
                 <w:sz w:val="16"/>
                 <w:szCs w:val="16"/>
               </w:rPr>
-              <w:t xml:space="preserve">Explained on slide 29</w:t>
+              <w:t xml:space="preserve">Explained on slide 28</w:t>
             </w:r>
           </w:p>
         </w:tc>
@@ -792,7 +715,7 @@
               <w:sdtPr>
                 <w:alias w:val="B1 choice"/>
                 <w:tag w:val="B1-choice"/>
-                <w:id w:val="1000011"/>
+                <w:id w:val="1000009"/>
                 <w:showingPlcHdr/>
                 <w:dropDownList>
                   <w:listItem w:displayText="a: Keep today's rule" w:value="a: Keep today's rule"/>
@@ -822,7 +745,7 @@
               <w:sdtPr>
                 <w:alias w:val="B1 notes"/>
                 <w:tag w:val="B1-notes"/>
-                <w:id w:val="1000012"/>
+                <w:id w:val="1000010"/>
                 <w:showingPlcHdr/>
               </w:sdtPr>
               <w:sdtContent>
@@ -845,6 +768,83 @@
           <w:p>
             <w:r>
               <w:t xml:space="preserve">B2. Can a partner withdraw a deal, and can it come back?</w:t>
+              <w:br/>
+            </w:r>
+            <w:r>
+              <w:rPr>
+                <w:b w:val="0"/>
+                <w:bCs w:val="0"/>
+                <w:color w:val="5B6B7A"/>
+                <w:sz w:val="16"/>
+                <w:szCs w:val="16"/>
+              </w:rPr>
+              <w:t xml:space="preserve">Explained on slide 29</w:t>
+            </w:r>
+          </w:p>
+        </w:tc>
+        <w:tc>
+          <w:tcPr>
+            <w:tcW w:w="2600" w:type="dxa"/>
+          </w:tcPr>
+          <w:p>
+            <w:sdt>
+              <w:sdtPr>
+                <w:alias w:val="B2 choice"/>
+                <w:tag w:val="B2-choice"/>
+                <w:id w:val="1000011"/>
+                <w:showingPlcHdr/>
+                <w:dropDownList>
+                  <w:listItem w:displayText="a: Partner requests, DBGI confirms, the place in line is lost for good" w:value="a: Partner requests, DBGI confirms, the place in line is lost for good"/>
+                  <w:listItem w:displayText="b: Partner withdraws instantly, DBGI is notified" w:value="b: Partner withdraws instantly, DBGI is notified"/>
+                  <w:listItem w:displayText="c: Withdrawn deals can be restored within a set time with their original place" w:value="c: Withdrawn deals can be restored within a set time with their original place"/>
+                  <w:listItem w:displayText="Keep what the portal does today" w:value="Keep what the portal does today"/>
+                  <w:listItem w:displayText="Other (see notes)" w:value="Other (see notes)"/>
+                  <w:listItem w:displayText="Skip, not my area" w:value="Skip, not my area"/>
+                </w:dropDownList>
+              </w:sdtPr>
+              <w:sdtContent>
+                <w:r>
+                  <w:rPr>
+                    <w:rStyle w:val="PlaceholderText"/>
+                  </w:rPr>
+                  <w:t xml:space="preserve">Pick an option.</w:t>
+                </w:r>
+              </w:sdtContent>
+            </w:sdt>
+          </w:p>
+        </w:tc>
+        <w:tc>
+          <w:tcPr>
+            <w:tcW w:w="2620" w:type="dxa"/>
+          </w:tcPr>
+          <w:p>
+            <w:sdt>
+              <w:sdtPr>
+                <w:alias w:val="B2 notes"/>
+                <w:tag w:val="B2-notes"/>
+                <w:id w:val="1000012"/>
+                <w:showingPlcHdr/>
+              </w:sdtPr>
+              <w:sdtContent>
+                <w:r>
+                  <w:rPr>
+                    <w:rStyle w:val="PlaceholderText"/>
+                  </w:rPr>
+                  <w:t xml:space="preserve">Type here.</w:t>
+                </w:r>
+              </w:sdtContent>
+            </w:sdt>
+          </w:p>
+        </w:tc>
+      </w:tr>
+      <w:tr>
+        <w:tc>
+          <w:tcPr>
+            <w:tcW w:w="3800" w:type="dxa"/>
+          </w:tcPr>
+          <w:p>
+            <w:r>
+              <w:t xml:space="preserve">B3. What happens when two registrations turn out to be one deal, or one turns out to be two?</w:t>
               <w:br/>
             </w:r>
             <w:r>
@@ -866,14 +866,13 @@
           <w:p>
             <w:sdt>
               <w:sdtPr>
-                <w:alias w:val="B2 choice"/>
-                <w:tag w:val="B2-choice"/>
+                <w:alias w:val="B3 choice"/>
+                <w:tag w:val="B3-choice"/>
                 <w:id w:val="1000013"/>
                 <w:showingPlcHdr/>
                 <w:dropDownList>
-                  <w:listItem w:displayText="a: Partner requests, DBGI confirms, the place in line is lost for good" w:value="a: Partner requests, DBGI confirms, the place in line is lost for good"/>
-                  <w:listItem w:displayText="b: Partner withdraws instantly, DBGI is notified" w:value="b: Partner withdraws instantly, DBGI is notified"/>
-                  <w:listItem w:displayText="c: Withdrawn deals can be restored within a set time with their original place" w:value="c: Withdrawn deals can be restored within a set time with their original place"/>
+                  <w:listItem w:displayText="a: Always keep each registration's original submission time for ranking, and re-review prices after any merge or split" w:value="a: Always keep each registration's original submission time for ranking, and re-review prices after any merge or split"/>
+                  <w:listItem w:displayText="b: DBGI decides case by case with a written reason" w:value="b: DBGI decides case by case with a written reason"/>
                   <w:listItem w:displayText="Keep what the portal does today" w:value="Keep what the portal does today"/>
                   <w:listItem w:displayText="Other (see notes)" w:value="Other (see notes)"/>
                   <w:listItem w:displayText="Skip, not my area" w:value="Skip, not my area"/>
@@ -897,8 +896,8 @@
           <w:p>
             <w:sdt>
               <w:sdtPr>
-                <w:alias w:val="B2 notes"/>
-                <w:tag w:val="B2-notes"/>
+                <w:alias w:val="B3 notes"/>
+                <w:tag w:val="B3-notes"/>
                 <w:id w:val="1000014"/>
                 <w:showingPlcHdr/>
               </w:sdtPr>
@@ -921,7 +920,7 @@
           </w:tcPr>
           <w:p>
             <w:r>
-              <w:t xml:space="preserve">B3. What happens when two registrations turn out to be one deal, or one turns out to be two?</w:t>
+              <w:t xml:space="preserve">B4. Who decides Won, Lost, Cancelled, or On hold?</w:t>
               <w:br/>
             </w:r>
             <w:r>
@@ -943,14 +942,13 @@
           <w:p>
             <w:sdt>
               <w:sdtPr>
-                <w:alias w:val="B3 choice"/>
-                <w:tag w:val="B3-choice"/>
+                <w:alias w:val="B4 choice"/>
+                <w:tag w:val="B4-choice"/>
                 <w:id w:val="1000015"/>
                 <w:showingPlcHdr/>
                 <w:dropDownList>
-                  <w:listItem w:displayText="a: Always keep each registration's original submission time for ranking, and re-review prices after any merge or split" w:value="a: Always keep each registration's original submission time for ranking, and re-review prices after any merge or split"/>
-                  <w:listItem w:displayText="b: DBGI decides case by case with a written reason" w:value="b: DBGI decides case by case with a written reason"/>
-                  <w:listItem w:displayText="Keep what the portal does today" w:value="Keep what the portal does today"/>
+                  <w:listItem w:displayText="a: Keep DBGI only" w:value="a: Keep DBGI only"/>
+                  <w:listItem w:displayText="b: Partners report, DBGI confirms" w:value="b: Partners report, DBGI confirms"/>
                   <w:listItem w:displayText="Other (see notes)" w:value="Other (see notes)"/>
                   <w:listItem w:displayText="Skip, not my area" w:value="Skip, not my area"/>
                 </w:dropDownList>
@@ -973,8 +971,8 @@
           <w:p>
             <w:sdt>
               <w:sdtPr>
-                <w:alias w:val="B3 notes"/>
-                <w:tag w:val="B3-notes"/>
+                <w:alias w:val="B4 notes"/>
+                <w:tag w:val="B4-notes"/>
                 <w:id w:val="1000016"/>
                 <w:showingPlcHdr/>
               </w:sdtPr>
@@ -997,7 +995,7 @@
           </w:tcPr>
           <w:p>
             <w:r>
-              <w:t xml:space="preserve">B4. Who decides Won, Lost, Cancelled, or On hold?</w:t>
+              <w:t xml:space="preserve">B5. What if two partners register at exactly the same moment?</w:t>
               <w:br/>
             </w:r>
             <w:r>
@@ -1019,13 +1017,13 @@
           <w:p>
             <w:sdt>
               <w:sdtPr>
-                <w:alias w:val="B4 choice"/>
-                <w:tag w:val="B4-choice"/>
+                <w:alias w:val="B5 choice"/>
+                <w:tag w:val="B5-choice"/>
                 <w:id w:val="1000017"/>
                 <w:showingPlcHdr/>
                 <w:dropDownList>
-                  <w:listItem w:displayText="a: Keep DBGI only" w:value="a: Keep DBGI only"/>
-                  <w:listItem w:displayText="b: Partners report, DBGI confirms" w:value="b: Partners report, DBGI confirms"/>
+                  <w:listItem w:displayText="a: Keep a shared rank, DBGI decides" w:value="a: Keep a shared rank, DBGI decides"/>
+                  <w:listItem w:displayText="b: The better-documented registration wins" w:value="b: The better-documented registration wins"/>
                   <w:listItem w:displayText="Other (see notes)" w:value="Other (see notes)"/>
                   <w:listItem w:displayText="Skip, not my area" w:value="Skip, not my area"/>
                 </w:dropDownList>
@@ -1048,8 +1046,8 @@
           <w:p>
             <w:sdt>
               <w:sdtPr>
-                <w:alias w:val="B4 notes"/>
-                <w:tag w:val="B4-notes"/>
+                <w:alias w:val="B5 notes"/>
+                <w:tag w:val="B5-notes"/>
                 <w:id w:val="1000018"/>
                 <w:showingPlcHdr/>
               </w:sdtPr>
@@ -1072,7 +1070,7 @@
           </w:tcPr>
           <w:p>
             <w:r>
-              <w:t xml:space="preserve">B5. What if two partners register at exactly the same moment?</w:t>
+              <w:t xml:space="preserve">B6. How long does an early registration stay valid?</w:t>
               <w:br/>
             </w:r>
             <w:r>
@@ -1094,13 +1092,14 @@
           <w:p>
             <w:sdt>
               <w:sdtPr>
-                <w:alias w:val="B5 choice"/>
-                <w:tag w:val="B5-choice"/>
+                <w:alias w:val="B6 choice"/>
+                <w:tag w:val="B6-choice"/>
                 <w:id w:val="1000019"/>
                 <w:showingPlcHdr/>
                 <w:dropDownList>
-                  <w:listItem w:displayText="a: Keep a shared rank, DBGI decides" w:value="a: Keep a shared rank, DBGI decides"/>
-                  <w:listItem w:displayText="b: The better-documented registration wins" w:value="b: The better-documented registration wins"/>
+                  <w:listItem w:displayText="a: 60 days, with a reminder 7 days before, then DBGI reviews" w:value="a: 60 days, with a reminder 7 days before, then DBGI reviews"/>
+                  <w:listItem w:displayText="b: No limit, DBGI cleans up manually" w:value="b: No limit, DBGI cleans up manually"/>
+                  <w:listItem w:displayText="Keep what the portal does today" w:value="Keep what the portal does today"/>
                   <w:listItem w:displayText="Other (see notes)" w:value="Other (see notes)"/>
                   <w:listItem w:displayText="Skip, not my area" w:value="Skip, not my area"/>
                 </w:dropDownList>
@@ -1123,8 +1122,8 @@
           <w:p>
             <w:sdt>
               <w:sdtPr>
-                <w:alias w:val="B5 notes"/>
-                <w:tag w:val="B5-notes"/>
+                <w:alias w:val="B6 notes"/>
+                <w:tag w:val="B6-notes"/>
                 <w:id w:val="1000020"/>
                 <w:showingPlcHdr/>
               </w:sdtPr>
@@ -1147,7 +1146,7 @@
           </w:tcPr>
           <w:p>
             <w:r>
-              <w:t xml:space="preserve">B6. How long does an early registration stay valid?</w:t>
+              <w:t xml:space="preserve">B7. What if the government postpones, cancels, or reposts a tender?</w:t>
               <w:br/>
             </w:r>
             <w:r>
@@ -1169,85 +1168,9 @@
           <w:p>
             <w:sdt>
               <w:sdtPr>
-                <w:alias w:val="B6 choice"/>
-                <w:tag w:val="B6-choice"/>
-                <w:id w:val="1000021"/>
-                <w:showingPlcHdr/>
-                <w:dropDownList>
-                  <w:listItem w:displayText="a: 60 days, with a reminder 7 days before, then DBGI reviews" w:value="a: 60 days, with a reminder 7 days before, then DBGI reviews"/>
-                  <w:listItem w:displayText="b: No limit, DBGI cleans up manually" w:value="b: No limit, DBGI cleans up manually"/>
-                  <w:listItem w:displayText="Keep what the portal does today" w:value="Keep what the portal does today"/>
-                  <w:listItem w:displayText="Other (see notes)" w:value="Other (see notes)"/>
-                  <w:listItem w:displayText="Skip, not my area" w:value="Skip, not my area"/>
-                </w:dropDownList>
-              </w:sdtPr>
-              <w:sdtContent>
-                <w:r>
-                  <w:rPr>
-                    <w:rStyle w:val="PlaceholderText"/>
-                  </w:rPr>
-                  <w:t xml:space="preserve">Pick an option.</w:t>
-                </w:r>
-              </w:sdtContent>
-            </w:sdt>
-          </w:p>
-        </w:tc>
-        <w:tc>
-          <w:tcPr>
-            <w:tcW w:w="2620" w:type="dxa"/>
-          </w:tcPr>
-          <w:p>
-            <w:sdt>
-              <w:sdtPr>
-                <w:alias w:val="B6 notes"/>
-                <w:tag w:val="B6-notes"/>
-                <w:id w:val="1000022"/>
-                <w:showingPlcHdr/>
-              </w:sdtPr>
-              <w:sdtContent>
-                <w:r>
-                  <w:rPr>
-                    <w:rStyle w:val="PlaceholderText"/>
-                  </w:rPr>
-                  <w:t xml:space="preserve">Type here.</w:t>
-                </w:r>
-              </w:sdtContent>
-            </w:sdt>
-          </w:p>
-        </w:tc>
-      </w:tr>
-      <w:tr>
-        <w:tc>
-          <w:tcPr>
-            <w:tcW w:w="3800" w:type="dxa"/>
-          </w:tcPr>
-          <w:p>
-            <w:r>
-              <w:t xml:space="preserve">B7. What if the government postpones, cancels, or reposts a tender?</w:t>
-              <w:br/>
-            </w:r>
-            <w:r>
-              <w:rPr>
-                <w:b w:val="0"/>
-                <w:bCs w:val="0"/>
-                <w:color w:val="5B6B7A"/>
-                <w:sz w:val="16"/>
-                <w:szCs w:val="16"/>
-              </w:rPr>
-              <w:t xml:space="preserve">Explained on slide 35</w:t>
-            </w:r>
-          </w:p>
-        </w:tc>
-        <w:tc>
-          <w:tcPr>
-            <w:tcW w:w="2600" w:type="dxa"/>
-          </w:tcPr>
-          <w:p>
-            <w:sdt>
-              <w:sdtPr>
                 <w:alias w:val="B7 choice"/>
                 <w:tag w:val="B7-choice"/>
-                <w:id w:val="1000023"/>
+                <w:id w:val="1000021"/>
                 <w:showingPlcHdr/>
                 <w:dropDownList>
                   <w:listItem w:displayText="a: A repost of the same project keeps the original place in line" w:value="a: A repost of the same project keeps the original place in line"/>
@@ -1278,7 +1201,7 @@
               <w:sdtPr>
                 <w:alias w:val="B7 notes"/>
                 <w:tag w:val="B7-notes"/>
-                <w:id w:val="1000024"/>
+                <w:id w:val="1000022"/>
                 <w:showingPlcHdr/>
               </w:sdtPr>
               <w:sdtContent>
@@ -1369,7 +1292,7 @@
                 <w:sz w:val="16"/>
                 <w:szCs w:val="16"/>
               </w:rPr>
-              <w:t xml:space="preserve">Explained on slide 36</w:t>
+              <w:t xml:space="preserve">Explained on slide 35</w:t>
             </w:r>
           </w:p>
         </w:tc>
@@ -1382,7 +1305,7 @@
               <w:sdtPr>
                 <w:alias w:val="C1 choice"/>
                 <w:tag w:val="C1-choice"/>
-                <w:id w:val="1000025"/>
+                <w:id w:val="1000023"/>
                 <w:showingPlcHdr/>
                 <w:dropDownList>
                   <w:listItem w:displayText="a: 90 days, reminder 14 days before" w:value="a: 90 days, reminder 14 days before"/>
@@ -1412,7 +1335,7 @@
               <w:sdtPr>
                 <w:alias w:val="C1 notes"/>
                 <w:tag w:val="C1-notes"/>
-                <w:id w:val="1000026"/>
+                <w:id w:val="1000024"/>
                 <w:showingPlcHdr/>
               </w:sdtPr>
               <w:sdtContent>
@@ -1435,6 +1358,83 @@
           <w:p>
             <w:r>
               <w:t xml:space="preserve">C2. Are prices with or without VAT?</w:t>
+              <w:br/>
+            </w:r>
+            <w:r>
+              <w:rPr>
+                <w:b w:val="0"/>
+                <w:bCs w:val="0"/>
+                <w:color w:val="5B6B7A"/>
+                <w:sz w:val="16"/>
+                <w:szCs w:val="16"/>
+              </w:rPr>
+              <w:t xml:space="preserve">Explained on slide 36</w:t>
+            </w:r>
+          </w:p>
+        </w:tc>
+        <w:tc>
+          <w:tcPr>
+            <w:tcW w:w="2600" w:type="dxa"/>
+          </w:tcPr>
+          <w:p>
+            <w:sdt>
+              <w:sdtPr>
+                <w:alias w:val="C2 choice"/>
+                <w:tag w:val="C2-choice"/>
+                <w:id w:val="1000025"/>
+                <w:showingPlcHdr/>
+                <w:dropDownList>
+                  <w:listItem w:displayText="a: All prices VAT-inclusive" w:value="a: All prices VAT-inclusive"/>
+                  <w:listItem w:displayText="b: All VAT-exclusive" w:value="b: All VAT-exclusive"/>
+                  <w:listItem w:displayText="c: Set per product" w:value="c: Set per product"/>
+                  <w:listItem w:displayText="Keep what the portal does today" w:value="Keep what the portal does today"/>
+                  <w:listItem w:displayText="Other (see notes)" w:value="Other (see notes)"/>
+                  <w:listItem w:displayText="Skip, not my area" w:value="Skip, not my area"/>
+                </w:dropDownList>
+              </w:sdtPr>
+              <w:sdtContent>
+                <w:r>
+                  <w:rPr>
+                    <w:rStyle w:val="PlaceholderText"/>
+                  </w:rPr>
+                  <w:t xml:space="preserve">Pick an option.</w:t>
+                </w:r>
+              </w:sdtContent>
+            </w:sdt>
+          </w:p>
+        </w:tc>
+        <w:tc>
+          <w:tcPr>
+            <w:tcW w:w="2620" w:type="dxa"/>
+          </w:tcPr>
+          <w:p>
+            <w:sdt>
+              <w:sdtPr>
+                <w:alias w:val="C2 notes"/>
+                <w:tag w:val="C2-notes"/>
+                <w:id w:val="1000026"/>
+                <w:showingPlcHdr/>
+              </w:sdtPr>
+              <w:sdtContent>
+                <w:r>
+                  <w:rPr>
+                    <w:rStyle w:val="PlaceholderText"/>
+                  </w:rPr>
+                  <w:t xml:space="preserve">Type here.</w:t>
+                </w:r>
+              </w:sdtContent>
+            </w:sdt>
+          </w:p>
+        </w:tc>
+      </w:tr>
+      <w:tr>
+        <w:tc>
+          <w:tcPr>
+            <w:tcW w:w="3800" w:type="dxa"/>
+          </w:tcPr>
+          <w:p>
+            <w:r>
+              <w:t xml:space="preserve">C3. How should totals be rounded?</w:t>
               <w:br/>
             </w:r>
             <w:r>
@@ -1456,14 +1456,13 @@
           <w:p>
             <w:sdt>
               <w:sdtPr>
-                <w:alias w:val="C2 choice"/>
-                <w:tag w:val="C2-choice"/>
+                <w:alias w:val="C3 choice"/>
+                <w:tag w:val="C3-choice"/>
                 <w:id w:val="1000027"/>
                 <w:showingPlcHdr/>
                 <w:dropDownList>
-                  <w:listItem w:displayText="a: All prices VAT-inclusive" w:value="a: All prices VAT-inclusive"/>
-                  <w:listItem w:displayText="b: All VAT-exclusive" w:value="b: All VAT-exclusive"/>
-                  <w:listItem w:displayText="c: Set per product" w:value="c: Set per product"/>
+                  <w:listItem w:displayText="a: Round each line to 2 decimals, add the lines" w:value="a: Round each line to 2 decimals, add the lines"/>
+                  <w:listItem w:displayText="b: Round only the grand total" w:value="b: Round only the grand total"/>
                   <w:listItem w:displayText="Keep what the portal does today" w:value="Keep what the portal does today"/>
                   <w:listItem w:displayText="Other (see notes)" w:value="Other (see notes)"/>
                   <w:listItem w:displayText="Skip, not my area" w:value="Skip, not my area"/>
@@ -1487,8 +1486,8 @@
           <w:p>
             <w:sdt>
               <w:sdtPr>
-                <w:alias w:val="C2 notes"/>
-                <w:tag w:val="C2-notes"/>
+                <w:alias w:val="C3 notes"/>
+                <w:tag w:val="C3-notes"/>
                 <w:id w:val="1000028"/>
                 <w:showingPlcHdr/>
               </w:sdtPr>
@@ -1511,7 +1510,7 @@
           </w:tcPr>
           <w:p>
             <w:r>
-              <w:t xml:space="preserve">C3. How should totals be rounded?</w:t>
+              <w:t xml:space="preserve">C4. Can DBGI approve a price for a product that is not in the catalog yet?</w:t>
               <w:br/>
             </w:r>
             <w:r>
@@ -1533,13 +1532,13 @@
           <w:p>
             <w:sdt>
               <w:sdtPr>
-                <w:alias w:val="C3 choice"/>
-                <w:tag w:val="C3-choice"/>
+                <w:alias w:val="C4 choice"/>
+                <w:tag w:val="C4-choice"/>
                 <w:id w:val="1000029"/>
                 <w:showingPlcHdr/>
                 <w:dropDownList>
-                  <w:listItem w:displayText="a: Round each line to 2 decimals, add the lines" w:value="a: Round each line to 2 decimals, add the lines"/>
-                  <w:listItem w:displayText="b: Round only the grand total" w:value="b: Round only the grand total"/>
+                  <w:listItem w:displayText="a: DBGI adds the product to the catalog first, then it gets reviewed" w:value="a: DBGI adds the product to the catalog first, then it gets reviewed"/>
+                  <w:listItem w:displayText="b: Approve it as typed, under an &quot;Other products&quot; group" w:value="b: Approve it as typed, under an &quot;Other products&quot; group"/>
                   <w:listItem w:displayText="Keep what the portal does today" w:value="Keep what the portal does today"/>
                   <w:listItem w:displayText="Other (see notes)" w:value="Other (see notes)"/>
                   <w:listItem w:displayText="Skip, not my area" w:value="Skip, not my area"/>
@@ -1563,8 +1562,8 @@
           <w:p>
             <w:sdt>
               <w:sdtPr>
-                <w:alias w:val="C3 notes"/>
-                <w:tag w:val="C3-notes"/>
+                <w:alias w:val="C4 notes"/>
+                <w:tag w:val="C4-notes"/>
                 <w:id w:val="1000030"/>
                 <w:showingPlcHdr/>
               </w:sdtPr>
@@ -1587,7 +1586,7 @@
           </w:tcPr>
           <w:p>
             <w:r>
-              <w:t xml:space="preserve">C4. Can DBGI approve a price for a product that is not in the catalog yet?</w:t>
+              <w:t xml:space="preserve">C5. What can partners see about prices?</w:t>
               <w:br/>
             </w:r>
             <w:r>
@@ -1609,85 +1608,9 @@
           <w:p>
             <w:sdt>
               <w:sdtPr>
-                <w:alias w:val="C4 choice"/>
-                <w:tag w:val="C4-choice"/>
-                <w:id w:val="1000031"/>
-                <w:showingPlcHdr/>
-                <w:dropDownList>
-                  <w:listItem w:displayText="a: DBGI adds the product to the catalog first, then it gets reviewed" w:value="a: DBGI adds the product to the catalog first, then it gets reviewed"/>
-                  <w:listItem w:displayText="b: Approve it as typed, under an &quot;Other products&quot; group" w:value="b: Approve it as typed, under an &quot;Other products&quot; group"/>
-                  <w:listItem w:displayText="Keep what the portal does today" w:value="Keep what the portal does today"/>
-                  <w:listItem w:displayText="Other (see notes)" w:value="Other (see notes)"/>
-                  <w:listItem w:displayText="Skip, not my area" w:value="Skip, not my area"/>
-                </w:dropDownList>
-              </w:sdtPr>
-              <w:sdtContent>
-                <w:r>
-                  <w:rPr>
-                    <w:rStyle w:val="PlaceholderText"/>
-                  </w:rPr>
-                  <w:t xml:space="preserve">Pick an option.</w:t>
-                </w:r>
-              </w:sdtContent>
-            </w:sdt>
-          </w:p>
-        </w:tc>
-        <w:tc>
-          <w:tcPr>
-            <w:tcW w:w="2620" w:type="dxa"/>
-          </w:tcPr>
-          <w:p>
-            <w:sdt>
-              <w:sdtPr>
-                <w:alias w:val="C4 notes"/>
-                <w:tag w:val="C4-notes"/>
-                <w:id w:val="1000032"/>
-                <w:showingPlcHdr/>
-              </w:sdtPr>
-              <w:sdtContent>
-                <w:r>
-                  <w:rPr>
-                    <w:rStyle w:val="PlaceholderText"/>
-                  </w:rPr>
-                  <w:t xml:space="preserve">Type here.</w:t>
-                </w:r>
-              </w:sdtContent>
-            </w:sdt>
-          </w:p>
-        </w:tc>
-      </w:tr>
-      <w:tr>
-        <w:tc>
-          <w:tcPr>
-            <w:tcW w:w="3800" w:type="dxa"/>
-          </w:tcPr>
-          <w:p>
-            <w:r>
-              <w:t xml:space="preserve">C5. What can partners see about prices?</w:t>
-              <w:br/>
-            </w:r>
-            <w:r>
-              <w:rPr>
-                <w:b w:val="0"/>
-                <w:bCs w:val="0"/>
-                <w:color w:val="5B6B7A"/>
-                <w:sz w:val="16"/>
-                <w:szCs w:val="16"/>
-              </w:rPr>
-              <w:t xml:space="preserve">Explained on slide 40</w:t>
-            </w:r>
-          </w:p>
-        </w:tc>
-        <w:tc>
-          <w:tcPr>
-            <w:tcW w:w="2600" w:type="dxa"/>
-          </w:tcPr>
-          <w:p>
-            <w:sdt>
-              <w:sdtPr>
                 <w:alias w:val="C5 choice"/>
                 <w:tag w:val="C5-choice"/>
-                <w:id w:val="1000033"/>
+                <w:id w:val="1000031"/>
                 <w:showingPlcHdr/>
                 <w:dropDownList>
                   <w:listItem w:displayText="a: Keep today's rule" w:value="a: Keep today's rule"/>
@@ -1716,7 +1639,7 @@
               <w:sdtPr>
                 <w:alias w:val="C5 notes"/>
                 <w:tag w:val="C5-notes"/>
-                <w:id w:val="1000034"/>
+                <w:id w:val="1000032"/>
                 <w:showingPlcHdr/>
               </w:sdtPr>
               <w:sdtContent>
@@ -1807,7 +1730,7 @@
                 <w:sz w:val="16"/>
                 <w:szCs w:val="16"/>
               </w:rPr>
-              <w:t xml:space="preserve">Explained on slide 41</w:t>
+              <w:t xml:space="preserve">Explained on slide 40</w:t>
             </w:r>
           </w:p>
         </w:tc>
@@ -1846,7 +1769,7 @@
               <w:sdtPr>
                 <w:alias w:val="D1 notes"/>
                 <w:tag w:val="D1-notes"/>
-                <w:id w:val="1000035"/>
+                <w:id w:val="1000033"/>
                 <w:showingPlcHdr/>
               </w:sdtPr>
               <w:sdtContent>
@@ -1869,6 +1792,82 @@
           <w:p>
             <w:r>
               <w:t xml:space="preserve">D2. Who gets which emails?</w:t>
+              <w:br/>
+            </w:r>
+            <w:r>
+              <w:rPr>
+                <w:b w:val="0"/>
+                <w:bCs w:val="0"/>
+                <w:color w:val="5B6B7A"/>
+                <w:sz w:val="16"/>
+                <w:szCs w:val="16"/>
+              </w:rPr>
+              <w:t xml:space="preserve">Explained on slide 41</w:t>
+            </w:r>
+          </w:p>
+        </w:tc>
+        <w:tc>
+          <w:tcPr>
+            <w:tcW w:w="2600" w:type="dxa"/>
+          </w:tcPr>
+          <w:p>
+            <w:sdt>
+              <w:sdtPr>
+                <w:alias w:val="D2 choice"/>
+                <w:tag w:val="D2-choice"/>
+                <w:id w:val="1000034"/>
+                <w:showingPlcHdr/>
+                <w:dropDownList>
+                  <w:listItem w:displayText="a: Keep today's rule" w:value="a: Keep today's rule"/>
+                  <w:listItem w:displayText="b: Email only the person who submitted" w:value="b: Email only the person who submitted"/>
+                  <w:listItem w:displayText="c: Also email DBGI reviewers when something needs action" w:value="c: Also email DBGI reviewers when something needs action"/>
+                  <w:listItem w:displayText="Other (see notes)" w:value="Other (see notes)"/>
+                  <w:listItem w:displayText="Skip, not my area" w:value="Skip, not my area"/>
+                </w:dropDownList>
+              </w:sdtPr>
+              <w:sdtContent>
+                <w:r>
+                  <w:rPr>
+                    <w:rStyle w:val="PlaceholderText"/>
+                  </w:rPr>
+                  <w:t xml:space="preserve">Pick an option.</w:t>
+                </w:r>
+              </w:sdtContent>
+            </w:sdt>
+          </w:p>
+        </w:tc>
+        <w:tc>
+          <w:tcPr>
+            <w:tcW w:w="2620" w:type="dxa"/>
+          </w:tcPr>
+          <w:p>
+            <w:sdt>
+              <w:sdtPr>
+                <w:alias w:val="D2 notes"/>
+                <w:tag w:val="D2-notes"/>
+                <w:id w:val="1000035"/>
+                <w:showingPlcHdr/>
+              </w:sdtPr>
+              <w:sdtContent>
+                <w:r>
+                  <w:rPr>
+                    <w:rStyle w:val="PlaceholderText"/>
+                  </w:rPr>
+                  <w:t xml:space="preserve">Type here.</w:t>
+                </w:r>
+              </w:sdtContent>
+            </w:sdt>
+          </w:p>
+        </w:tc>
+      </w:tr>
+      <w:tr>
+        <w:tc>
+          <w:tcPr>
+            <w:tcW w:w="3800" w:type="dxa"/>
+          </w:tcPr>
+          <w:p>
+            <w:r>
+              <w:t xml:space="preserve">D3. Records, backups, and recovery</w:t>
               <w:br/>
             </w:r>
             <w:r>
@@ -1890,14 +1889,13 @@
           <w:p>
             <w:sdt>
               <w:sdtPr>
-                <w:alias w:val="D2 choice"/>
-                <w:tag w:val="D2-choice"/>
+                <w:alias w:val="D3 choice"/>
+                <w:tag w:val="D3-choice"/>
                 <w:id w:val="1000036"/>
                 <w:showingPlcHdr/>
                 <w:dropDownList>
-                  <w:listItem w:displayText="a: Keep today's rule" w:value="a: Keep today's rule"/>
-                  <w:listItem w:displayText="b: Email only the person who submitted" w:value="b: Email only the person who submitted"/>
-                  <w:listItem w:displayText="c: Also email DBGI reviewers when something needs action" w:value="c: Also email DBGI reviewers when something needs action"/>
+                  <w:listItem w:displayText="a: Keep everything for 5 years, daily backups, back within one working day" w:value="a: Keep everything for 5 years, daily backups, back within one working day"/>
+                  <w:listItem w:displayText="b: IT sets the targets" w:value="b: IT sets the targets"/>
                   <w:listItem w:displayText="Other (see notes)" w:value="Other (see notes)"/>
                   <w:listItem w:displayText="Skip, not my area" w:value="Skip, not my area"/>
                 </w:dropDownList>
@@ -1920,8 +1918,8 @@
           <w:p>
             <w:sdt>
               <w:sdtPr>
-                <w:alias w:val="D2 notes"/>
-                <w:tag w:val="D2-notes"/>
+                <w:alias w:val="D3 notes"/>
+                <w:tag w:val="D3-notes"/>
                 <w:id w:val="1000037"/>
                 <w:showingPlcHdr/>
               </w:sdtPr>
@@ -1944,7 +1942,7 @@
           </w:tcPr>
           <w:p>
             <w:r>
-              <w:t xml:space="preserve">D3. Records, backups, and recovery</w:t>
+              <w:t xml:space="preserve">D4. Business hours and holidays</w:t>
               <w:br/>
             </w:r>
             <w:r>
@@ -1966,84 +1964,9 @@
           <w:p>
             <w:sdt>
               <w:sdtPr>
-                <w:alias w:val="D3 choice"/>
-                <w:tag w:val="D3-choice"/>
-                <w:id w:val="1000038"/>
-                <w:showingPlcHdr/>
-                <w:dropDownList>
-                  <w:listItem w:displayText="a: Keep everything for 5 years, daily backups, back within one working day" w:value="a: Keep everything for 5 years, daily backups, back within one working day"/>
-                  <w:listItem w:displayText="b: IT sets the targets" w:value="b: IT sets the targets"/>
-                  <w:listItem w:displayText="Other (see notes)" w:value="Other (see notes)"/>
-                  <w:listItem w:displayText="Skip, not my area" w:value="Skip, not my area"/>
-                </w:dropDownList>
-              </w:sdtPr>
-              <w:sdtContent>
-                <w:r>
-                  <w:rPr>
-                    <w:rStyle w:val="PlaceholderText"/>
-                  </w:rPr>
-                  <w:t xml:space="preserve">Pick an option.</w:t>
-                </w:r>
-              </w:sdtContent>
-            </w:sdt>
-          </w:p>
-        </w:tc>
-        <w:tc>
-          <w:tcPr>
-            <w:tcW w:w="2620" w:type="dxa"/>
-          </w:tcPr>
-          <w:p>
-            <w:sdt>
-              <w:sdtPr>
-                <w:alias w:val="D3 notes"/>
-                <w:tag w:val="D3-notes"/>
-                <w:id w:val="1000039"/>
-                <w:showingPlcHdr/>
-              </w:sdtPr>
-              <w:sdtContent>
-                <w:r>
-                  <w:rPr>
-                    <w:rStyle w:val="PlaceholderText"/>
-                  </w:rPr>
-                  <w:t xml:space="preserve">Type here.</w:t>
-                </w:r>
-              </w:sdtContent>
-            </w:sdt>
-          </w:p>
-        </w:tc>
-      </w:tr>
-      <w:tr>
-        <w:tc>
-          <w:tcPr>
-            <w:tcW w:w="3800" w:type="dxa"/>
-          </w:tcPr>
-          <w:p>
-            <w:r>
-              <w:t xml:space="preserve">D4. Business hours and holidays</w:t>
-              <w:br/>
-            </w:r>
-            <w:r>
-              <w:rPr>
-                <w:b w:val="0"/>
-                <w:bCs w:val="0"/>
-                <w:color w:val="5B6B7A"/>
-                <w:sz w:val="16"/>
-                <w:szCs w:val="16"/>
-              </w:rPr>
-              <w:t xml:space="preserve">Explained on slide 44</w:t>
-            </w:r>
-          </w:p>
-        </w:tc>
-        <w:tc>
-          <w:tcPr>
-            <w:tcW w:w="2600" w:type="dxa"/>
-          </w:tcPr>
-          <w:p>
-            <w:sdt>
-              <w:sdtPr>
                 <w:alias w:val="D4 choice"/>
                 <w:tag w:val="D4-choice"/>
-                <w:id w:val="1000040"/>
+                <w:id w:val="1000038"/>
                 <w:showingPlcHdr/>
                 <w:dropDownList>
                   <w:listItem w:displayText="a: Monday to Friday, Philippine public holidays excluded, 5:00 PM cutoff" w:value="a: Monday to Friday, Philippine public holidays excluded, 5:00 PM cutoff"/>
@@ -2073,7 +1996,7 @@
               <w:sdtPr>
                 <w:alias w:val="D4 notes"/>
                 <w:tag w:val="D4-notes"/>
-                <w:id w:val="1000041"/>
+                <w:id w:val="1000039"/>
                 <w:showingPlcHdr/>
               </w:sdtPr>
               <w:sdtContent>
@@ -2111,7 +2034,7 @@
         <w:sdtPr>
           <w:alias w:val="Other comments"/>
           <w:tag w:val="comments"/>
-          <w:id w:val="1000042"/>
+          <w:id w:val="1000040"/>
           <w:showingPlcHdr/>
         </w:sdtPr>
         <w:sdtContent>

</xml_diff>